<commit_message>
added new permissions module and others
</commit_message>
<xml_diff>
--- a/backend/templates/mop/CCTV_Installation.docx
+++ b/backend/templates/mop/CCTV_Installation.docx
@@ -27,7 +27,7 @@
             <wp:extent cx="13850620" cy="10807700"/>
             <wp:effectExtent l="0" t="0" r="0" b="0"/>
             <wp:wrapNone/>
-            <wp:docPr id="42" name="Picture 42" descr="A group of clouds in the sky  Description automatically generated"/>
+            <wp:docPr id="42" name="Picture 42" descr="A group of clouds in the sky&#10;&#10;Description automatically generated"/>
             <wp:cNvGraphicFramePr>
               <a:graphicFrameLocks xmlns:a="http://schemas.openxmlformats.org/drawingml/2006/main" noChangeAspect="1"/>
             </wp:cNvGraphicFramePr>
@@ -96,7 +96,7 @@
             <wp:extent cx="8317865" cy="9031605"/>
             <wp:effectExtent l="0" t="0" r="6985" b="0"/>
             <wp:wrapNone/>
-            <wp:docPr id="43" name="Picture 43" descr="A close up of a logo  Description automatically generated"/>
+            <wp:docPr id="43" name="Picture 43" descr="A close up of a logo&#10;&#10;Description automatically generated"/>
             <wp:cNvGraphicFramePr>
               <a:graphicFrameLocks xmlns:a="http://schemas.openxmlformats.org/drawingml/2006/main" noChangeAspect="1"/>
             </wp:cNvGraphicFramePr>
@@ -109,7 +109,6 @@
                   </pic:nvPicPr>
                   <pic:blipFill rotWithShape="1">
                     <a:blip r:embed="rId13" cstate="print">
-                      <a:alphaModFix amt="22000"/>
                       <a:extLst>
                         <a:ext uri="{28A0092B-C50C-407E-A947-70E740481C1C}">
                           <a14:useLocalDpi xmlns:a14="http://schemas.microsoft.com/office/drawing/2010/main" val="0"/>
@@ -181,7 +180,7 @@
             <wp:extent cx="2387600" cy="737235"/>
             <wp:effectExtent l="0" t="0" r="0" b="0"/>
             <wp:wrapTopAndBottom/>
-            <wp:docPr id="134" name="Picture 134" descr="A close up of a logo  Description automatically generated"/>
+            <wp:docPr id="134" name="Picture 134" descr="A close up of a logo&#10;&#10;Description automatically generated"/>
             <wp:cNvGraphicFramePr>
               <a:graphicFrameLocks xmlns:a="http://schemas.openxmlformats.org/drawingml/2006/main" noChangeAspect="1"/>
             </wp:cNvGraphicFramePr>
@@ -651,7 +650,7 @@
                 <v:stroke joinstyle="miter"/>
                 <v:path gradientshapeok="t" o:connecttype="rect"/>
               </v:shapetype>
-              <v:shape id="Text Box 133" o:spid="_x0000_s1026" type="#_x0000_t202" style="position:absolute;margin-left:0;margin-top:1.15pt;width:459.3pt;height:73pt;z-index:251658293;visibility:visible;mso-wrap-style:square;mso-width-percent:0;mso-height-percent:0;mso-wrap-distance-left:9pt;mso-wrap-distance-top:0;mso-wrap-distance-right:9pt;mso-wrap-distance-bottom:0;mso-position-horizontal:left;mso-position-horizontal-relative:margin;mso-position-vertical:absolute;mso-position-vertical-relative:text;mso-width-percent:0;mso-height-percent:0;mso-width-relative:margin;mso-height-relative:margin;v-text-anchor:top" o:gfxdata="UEsDBBQABgAIAAAAIQC2gziS/gAAAOEBAAATAAAAW0NvbnRlbnRfVHlwZXNdLnhtbJSRQU7DMBBF 90jcwfIWJU67QAgl6YK0S0CoHGBkTxKLZGx5TGhvj5O2G0SRWNoz/78nu9wcxkFMGNg6quQqL6RA 0s5Y6ir5vt9lD1JwBDIwOMJKHpHlpr69KfdHjyxSmriSfYz+USnWPY7AufNIadK6MEJMx9ApD/oD OlTrorhX2lFEilmcO2RdNtjC5xDF9pCuTyYBB5bi6bQ4syoJ3g9WQ0ymaiLzg5KdCXlKLjvcW893 SUOqXwnz5DrgnHtJTxOsQfEKIT7DmDSUCaxw7Rqn8787ZsmRM9e2VmPeBN4uqYvTtW7jvijg9N/y JsXecLq0q+WD6m8AAAD//wMAUEsDBBQABgAIAAAAIQA4/SH/1gAAAJQBAAALAAAAX3JlbHMvLnJl bHOkkMFqwzAMhu+DvYPRfXGawxijTi+j0GvpHsDYimMaW0Yy2fr2M4PBMnrbUb/Q94l/f/hMi1qR JVI2sOt6UJgd+ZiDgffL8ekFlFSbvV0oo4EbChzGx4f9GRdb25HMsYhqlCwG5lrLq9biZkxWOiqY 22YiTra2kYMu1l1tQD30/bPm3wwYN0x18gb45AdQl1tp5j/sFB2T0FQ7R0nTNEV3j6o9feQzro1i OWA14Fm+Q8a1a8+Bvu/d/dMb2JY5uiPbhG/ktn4cqGU/er3pcvwCAAD//wMAUEsDBBQABgAIAAAA IQBd8KJAFwIAACwEAAAOAAAAZHJzL2Uyb0RvYy54bWysU9uO2yAQfa/Uf0C8N7Zz2YsVZ5XuKlWl aHelbLXPBENsCTMUSOz06ztg56Jtn6q+wMAMcznnMH/oGkUOwroadEGzUUqJ0BzKWu8K+uNt9eWO EueZLpkCLQp6FI4+LD5/mrcmF2OoQJXCEkyiXd6aglbemzxJHK9Ew9wIjNDolGAb5vFod0lpWYvZ G5WM0/QmacGWxgIXzuHtU++ki5hfSsH9i5ROeKIKir35uNq4bsOaLOYs31lmqpoPbbB/6KJhtcai 51RPzDOyt/UfqZqaW3Ag/YhDk4CUNRdxBpwmSz9Ms6mYEXEWBMeZM0zu/6Xlz4eNebXEd1+hQwID IK1xucPLME8nbRN27JSgHyE8nmETnSccL2d3k0mWoYuj7358m6UR1+Ty2ljnvwloSDAKapGWiBY7 rJ3Hihh6CgnFNKxqpSI1SpO2oDeTWRofnD34Qml8eOk1WL7bdsMAWyiPOJeFnnJn+KrG4mvm/Cuz yDH2i7r1L7hIBVgEBouSCuyvv92HeIQevZS0qJmCup97ZgUl6rtGUu6z6TSILB6ms9sxHuy1Z3vt 0fvmEVCWGf4Qw6MZ4r06mdJC847yXoaq6GKaY+2C+pP56Hsl4/fgYrmMQSgrw/xabwwPqQOcAdq3 7p1ZM+DvkblnOKmL5R9o6GN7IpZ7D7KOHAWAe1QH3FGSkbrh+wTNX59j1OWTL34DAAD//wMAUEsD BBQABgAIAAAAIQChjhY63gAAAAYBAAAPAAAAZHJzL2Rvd25yZXYueG1sTI/BTsMwEETvSPyDtUjc qNMUqhDiVFWkCgnBoaUXbk68TSLsdYjdNvD1LKdyHM1o5k2xmpwVJxxD70nBfJaAQGq86alVsH/f 3GUgQtRktPWECr4xwKq8vip0bvyZtnjaxVZwCYVcK+hiHHIpQ9Oh02HmByT2Dn50OrIcW2lGfeZy Z2WaJEvpdE+80OkBqw6bz93RKXipNm96W6cu+7HV8+thPXztPx6Uur2Z1k8gIk7xEoY/fEaHkplq fyQThFXAR6KCdAGCzcd5tgRRc+o+W4AsC/kfv/wFAAD//wMAUEsBAi0AFAAGAAgAAAAhALaDOJL+ AAAA4QEAABMAAAAAAAAAAAAAAAAAAAAAAFtDb250ZW50X1R5cGVzXS54bWxQSwECLQAUAAYACAAA ACEAOP0h/9YAAACUAQAACwAAAAAAAAAAAAAAAAAvAQAAX3JlbHMvLnJlbHNQSwECLQAUAAYACAAA ACEAXfCiQBcCAAAsBAAADgAAAAAAAAAAAAAAAAAuAgAAZHJzL2Uyb0RvYy54bWxQSwECLQAUAAYA CAAAACEAoY4WOt4AAAAGAQAADwAAAAAAAAAAAAAAAABxBAAAZHJzL2Rvd25yZXYueG1sUEsFBgAA AAAEAAQA8wAAAHwFAAAAAA== " filled="f" stroked="f" strokeweight=".5pt">
+              <v:shape id="Text Box 133" o:spid="_x0000_s1026" type="#_x0000_t202" style="position:absolute;margin-left:0;margin-top:1.15pt;width:459.3pt;height:73pt;z-index:251658293;visibility:visible;mso-wrap-style:square;mso-width-percent:0;mso-height-percent:0;mso-wrap-distance-left:9pt;mso-wrap-distance-top:0;mso-wrap-distance-right:9pt;mso-wrap-distance-bottom:0;mso-position-horizontal:left;mso-position-horizontal-relative:margin;mso-position-vertical:absolute;mso-position-vertical-relative:text;mso-width-percent:0;mso-height-percent:0;mso-width-relative:margin;mso-height-relative:margin;v-text-anchor:top" o:gfxdata="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" filled="f" stroked="f" strokeweight=".5pt">
                 <v:textbox>
                   <w:txbxContent>
                     <w:p>
@@ -788,7 +787,7 @@
             <wp:extent cx="8210550" cy="9031605"/>
             <wp:effectExtent l="0" t="0" r="0" b="0"/>
             <wp:wrapNone/>
-            <wp:docPr id="2026001092" name="Picture 2026001092" descr="A close up of a logo  Description automatically generated"/>
+            <wp:docPr id="2026001092" name="Picture 2026001092" descr="A close up of a logo&#10;&#10;Description automatically generated"/>
             <wp:cNvGraphicFramePr>
               <a:graphicFrameLocks xmlns:a="http://schemas.openxmlformats.org/drawingml/2006/main" noChangeAspect="1"/>
             </wp:cNvGraphicFramePr>
@@ -800,8 +799,7 @@
                     <pic:cNvPicPr/>
                   </pic:nvPicPr>
                   <pic:blipFill rotWithShape="1">
-                    <a:blip r:embed="rId13" cstate="print">
-                      <a:alphaModFix amt="22000"/>
+                    <a:blip r:embed="rIdBodyFaded" cstate="print">
                       <a:alphaModFix amt="20000"/>
                       <a:extLst>
                         <a:ext uri="{28A0092B-C50C-407E-A947-70E740481C1C}">
@@ -992,6 +990,20 @@
               </w:rPr>
               <w:t xml:space="preserve">{{TCN_SUMMARY}}</w:t>
             </w:r>
+            <w:r>
+              <w:rPr>
+                <w:rFonts w:ascii="Teshrin AR+LT" w:eastAsia="SimSun" w:hAnsi="Teshrin AR+LT" w:cs="Teshrin AR+LT"/>
+                <w:lang w:eastAsia="zh-CN"/>
+              </w:rPr>
+              <w:t xml:space="preserve"/>
+            </w:r>
+            <w:r>
+              <w:rPr>
+                <w:rFonts w:ascii="Teshrin AR+LT" w:eastAsia="SimSun" w:hAnsi="Teshrin AR+LT" w:cs="Teshrin AR+LT"/>
+                <w:lang w:eastAsia="zh-CN"/>
+              </w:rPr>
+              <w:t xml:space="preserve"/>
+            </w:r>
           </w:p>
         </w:tc>
       </w:tr>
@@ -1074,7 +1086,14 @@
                 <w:rFonts w:ascii="Teshrin AR+LT" w:hAnsi="Teshrin AR+LT" w:cs="Teshrin AR+LT"/>
                 <w:color w:val="FFFFFF"/>
               </w:rPr>
-              <w:t xml:space="preserve">Name of Requester:</w:t>
+              <w:t xml:space="preserve">Name of </w:t>
+            </w:r>
+            <w:r>
+              <w:rPr>
+                <w:rFonts w:ascii="Teshrin AR+LT" w:hAnsi="Teshrin AR+LT" w:cs="Teshrin AR+LT"/>
+                <w:color w:val="FFFFFF"/>
+              </w:rPr>
+              <w:t>Requester:</w:t>
             </w:r>
           </w:p>
         </w:tc>
@@ -1090,16 +1109,16 @@
               <w:jc w:val="center"/>
               <w:rPr>
                 <w:rFonts w:ascii="Teshrin AR+LT" w:hAnsi="Teshrin AR+LT" w:cs="Teshrin AR+LT"/>
-                <w:sz w:val="24"/>
-                <w:szCs w:val="24"/>
+                <w:sz w:val="22"/>
+                <w:szCs w:val="22"/>
                 <w:lang w:eastAsia="zh-CN"/>
               </w:rPr>
             </w:pPr>
             <w:r>
               <w:rPr>
                 <w:rFonts w:ascii="Teshrin AR+LT" w:hAnsi="Teshrin AR+LT" w:cs="Teshrin AR+LT"/>
-                <w:sz w:val="24"/>
-                <w:szCs w:val="24"/>
+                <w:sz w:val="22"/>
+                <w:szCs w:val="22"/>
                 <w:lang w:eastAsia="zh-CN"/>
               </w:rPr>
               <w:t xml:space="preserve">{{REQUESTER_NAME}}</w:t>
@@ -1147,16 +1166,16 @@
               <w:jc w:val="center"/>
               <w:rPr>
                 <w:rFonts w:ascii="Teshrin AR+LT" w:hAnsi="Teshrin AR+LT" w:cs="Teshrin AR+LT"/>
-                <w:sz w:val="24"/>
-                <w:szCs w:val="24"/>
+                <w:sz w:val="22"/>
+                <w:szCs w:val="22"/>
                 <w:lang w:eastAsia="zh-CN"/>
               </w:rPr>
             </w:pPr>
             <w:r>
               <w:rPr>
                 <w:rFonts w:ascii="Teshrin AR+LT" w:hAnsi="Teshrin AR+LT" w:cs="Teshrin AR+LT"/>
-                <w:sz w:val="24"/>
-                <w:szCs w:val="24"/>
+                <w:sz w:val="22"/>
+                <w:szCs w:val="22"/>
                 <w:lang w:eastAsia="zh-CN"/>
               </w:rPr>
               <w:t xml:space="preserve">{{PM_NAME}}</w:t>
@@ -1165,13 +1184,13 @@
           <w:p>
             <w:pPr>
               <w:pStyle w:val="2"/>
-              <w:spacing w:after="0" w:line="240" w:lineRule="auto"/>
+              <w:spacing w:after="0" w:line="192" w:lineRule="auto"/>
               <w:ind w:left="0"/>
               <w:jc w:val="center"/>
               <w:rPr>
                 <w:rFonts w:ascii="Teshrin AR+LT" w:hAnsi="Teshrin AR+LT" w:cs="Teshrin AR+LT"/>
-                <w:sz w:val="24"/>
-                <w:szCs w:val="24"/>
+                <w:sz w:val="22"/>
+                <w:szCs w:val="22"/>
                 <w:lang w:eastAsia="zh-CN"/>
               </w:rPr>
             </w:pPr>
@@ -1202,7 +1221,14 @@
                 <w:rFonts w:ascii="Teshrin AR+LT" w:hAnsi="Teshrin AR+LT" w:cs="Teshrin AR+LT"/>
                 <w:color w:val="FFFFFF"/>
               </w:rPr>
-              <w:t xml:space="preserve">Site Impact (YES/NO) </w:t>
+              <w:t xml:space="preserve">Site Impact </w:t>
+            </w:r>
+            <w:r>
+              <w:rPr>
+                <w:rFonts w:ascii="Teshrin AR+LT" w:hAnsi="Teshrin AR+LT" w:cs="Teshrin AR+LT"/>
+                <w:color w:val="FFFFFF"/>
+              </w:rPr>
+              <w:t xml:space="preserve">(YES/NO) </w:t>
             </w:r>
           </w:p>
         </w:tc>
@@ -1214,13 +1240,13 @@
           <w:p>
             <w:pPr>
               <w:pStyle w:val="2"/>
-              <w:spacing w:after="0" w:line="240" w:lineRule="auto"/>
+              <w:spacing w:after="0" w:line="192" w:lineRule="auto"/>
               <w:ind w:left="0"/>
               <w:jc w:val="center"/>
               <w:rPr>
                 <w:rFonts w:ascii="Teshrin AR+LT" w:hAnsi="Teshrin AR+LT" w:cs="Teshrin AR+LT"/>
-                <w:sz w:val="24"/>
-                <w:szCs w:val="24"/>
+                <w:sz w:val="22"/>
+                <w:szCs w:val="22"/>
                 <w:lang w:eastAsia="zh-CN"/>
               </w:rPr>
             </w:pPr>
@@ -1229,8 +1255,8 @@
                 <w:rFonts w:ascii="Teshrin AR+LT" w:hAnsi="Teshrin AR+LT" w:cs="Teshrin AR+LT"/>
                 <w:b/>
                 <w:bCs/>
-                <w:sz w:val="24"/>
-                <w:szCs w:val="24"/>
+                <w:sz w:val="22"/>
+                <w:szCs w:val="22"/>
                 <w:lang w:eastAsia="zh-CN"/>
               </w:rPr>
               <w:t xml:space="preserve">{{SITE_IMPACT}}</w:t>
@@ -1238,8 +1264,44 @@
             <w:r>
               <w:rPr>
                 <w:rFonts w:ascii="Teshrin AR+LT" w:hAnsi="Teshrin AR+LT" w:cs="Teshrin AR+LT"/>
-                <w:sz w:val="24"/>
-                <w:szCs w:val="24"/>
+                <w:sz w:val="22"/>
+                <w:szCs w:val="22"/>
+                <w:lang w:eastAsia="zh-CN"/>
+              </w:rPr>
+              <w:t xml:space="preserve"/>
+            </w:r>
+            <w:r>
+              <w:rPr>
+                <w:rFonts w:ascii="Teshrin AR+LT" w:hAnsi="Teshrin AR+LT" w:cs="Teshrin AR+LT"/>
+                <w:sz w:val="22"/>
+                <w:szCs w:val="22"/>
+                <w:lang w:eastAsia="zh-CN"/>
+              </w:rPr>
+              <w:t xml:space="preserve"/>
+            </w:r>
+            <w:r>
+              <w:rPr>
+                <w:rFonts w:ascii="Teshrin AR+LT" w:hAnsi="Teshrin AR+LT" w:cs="Teshrin AR+LT"/>
+                <w:sz w:val="22"/>
+                <w:szCs w:val="22"/>
+                <w:lang w:eastAsia="zh-CN"/>
+              </w:rPr>
+              <w:t xml:space="preserve"/>
+            </w:r>
+            <w:r>
+              <w:rPr>
+                <w:rFonts w:ascii="Teshrin AR+LT" w:hAnsi="Teshrin AR+LT" w:cs="Teshrin AR+LT"/>
+                <w:sz w:val="22"/>
+                <w:szCs w:val="22"/>
+                <w:lang w:eastAsia="zh-CN"/>
+              </w:rPr>
+              <w:t xml:space="preserve"/>
+            </w:r>
+            <w:r>
+              <w:rPr>
+                <w:rFonts w:ascii="Teshrin AR+LT" w:hAnsi="Teshrin AR+LT" w:cs="Teshrin AR+LT"/>
+                <w:sz w:val="22"/>
+                <w:szCs w:val="22"/>
                 <w:lang w:eastAsia="zh-CN"/>
               </w:rPr>
               <w:t xml:space="preserve"/>
@@ -1271,8 +1333,8 @@
           <w:b/>
           <w:bCs/>
           <w:color w:val="FC4C02"/>
-          <w:sz w:val="28"/>
-          <w:szCs w:val="28"/>
+          <w:sz w:val="26"/>
+          <w:szCs w:val="26"/>
         </w:rPr>
       </w:pPr>
       <w:r>
@@ -1281,8 +1343,8 @@
           <w:b/>
           <w:bCs/>
           <w:color w:val="FC4C02"/>
-          <w:sz w:val="28"/>
-          <w:szCs w:val="28"/>
+          <w:sz w:val="26"/>
+          <w:szCs w:val="26"/>
         </w:rPr>
         <w:t xml:space="preserve">TCN  Justification and Summary </w:t>
       </w:r>
@@ -1294,8 +1356,8 @@
         <w:rPr>
           <w:rFonts w:ascii="Teshrin AR+LT ExtraLight" w:hAnsi="Teshrin AR+LT ExtraLight" w:cs="Teshrin AR+LT ExtraLight"/>
           <w:color w:val="FC4C02"/>
-          <w:sz w:val="28"/>
-          <w:szCs w:val="28"/>
+          <w:sz w:val="26"/>
+          <w:szCs w:val="26"/>
         </w:rPr>
       </w:pPr>
     </w:p>
@@ -1316,7 +1378,35 @@
           <w:rFonts w:ascii="Teshrin AR+LT" w:hAnsi="Teshrin AR+LT" w:cs="Teshrin AR+LT"/>
           <w:color w:val="253746"/>
         </w:rPr>
-        <w:t xml:space="preserve">TCN request for Site Installation </w:t>
+        <w:t>TCN</w:t>
+      </w:r>
+      <w:r>
+        <w:rPr>
+          <w:rFonts w:ascii="Teshrin AR+LT" w:hAnsi="Teshrin AR+LT" w:cs="Teshrin AR+LT"/>
+          <w:color w:val="253746"/>
+        </w:rPr>
+        <w:t xml:space="preserve"> request for </w:t>
+      </w:r>
+      <w:r>
+        <w:rPr>
+          <w:rFonts w:ascii="Teshrin AR+LT" w:hAnsi="Teshrin AR+LT" w:cs="Teshrin AR+LT"/>
+          <w:color w:val="253746"/>
+        </w:rPr>
+        <w:t xml:space="preserve">Site </w:t>
+      </w:r>
+      <w:r>
+        <w:rPr>
+          <w:rFonts w:ascii="Teshrin AR+LT" w:hAnsi="Teshrin AR+LT" w:cs="Teshrin AR+LT"/>
+          <w:color w:val="253746"/>
+        </w:rPr>
+        <w:t>I</w:t>
+      </w:r>
+      <w:r>
+        <w:rPr>
+          <w:rFonts w:ascii="Teshrin AR+LT" w:hAnsi="Teshrin AR+LT" w:cs="Teshrin AR+LT"/>
+          <w:color w:val="253746"/>
+        </w:rPr>
+        <w:t xml:space="preserve">nstallation </w:t>
       </w:r>
     </w:p>
     <w:p>
@@ -1356,7 +1446,35 @@
           <w:rFonts w:ascii="Teshrin AR+LT" w:hAnsi="Teshrin AR+LT" w:cs="Teshrin AR+LT"/>
           <w:color w:val="253746"/>
         </w:rPr>
-        <w:t xml:space="preserve">There is NO Impact </w:t>
+        <w:t xml:space="preserve">There is </w:t>
+      </w:r>
+      <w:r>
+        <w:rPr>
+          <w:rFonts w:ascii="Teshrin AR+LT" w:hAnsi="Teshrin AR+LT" w:cs="Teshrin AR+LT"/>
+          <w:color w:val="253746"/>
+        </w:rPr>
+        <w:t>NO</w:t>
+      </w:r>
+      <w:r>
+        <w:rPr>
+          <w:rFonts w:ascii="Teshrin AR+LT" w:hAnsi="Teshrin AR+LT" w:cs="Teshrin AR+LT"/>
+          <w:color w:val="253746"/>
+        </w:rPr>
+        <w:t xml:space="preserve"> I</w:t>
+      </w:r>
+      <w:r>
+        <w:rPr>
+          <w:rFonts w:ascii="Teshrin AR+LT" w:hAnsi="Teshrin AR+LT" w:cs="Teshrin AR+LT"/>
+          <w:color w:val="253746"/>
+        </w:rPr>
+        <w:t>mpact</w:t>
+      </w:r>
+      <w:r>
+        <w:rPr>
+          <w:rFonts w:ascii="Teshrin AR+LT" w:hAnsi="Teshrin AR+LT" w:cs="Teshrin AR+LT"/>
+          <w:color w:val="253746"/>
+        </w:rPr>
+        <w:t xml:space="preserve"> </w:t>
       </w:r>
     </w:p>
     <w:p>
@@ -1374,8 +1492,8 @@
           <w:b/>
           <w:bCs/>
           <w:color w:val="FC4C02"/>
-          <w:sz w:val="28"/>
-          <w:szCs w:val="28"/>
+          <w:sz w:val="26"/>
+          <w:szCs w:val="26"/>
         </w:rPr>
       </w:pPr>
       <w:r>
@@ -1384,8 +1502,8 @@
           <w:b/>
           <w:bCs/>
           <w:color w:val="FC4C02"/>
-          <w:sz w:val="28"/>
-          <w:szCs w:val="28"/>
+          <w:sz w:val="26"/>
+          <w:szCs w:val="26"/>
         </w:rPr>
         <w:t xml:space="preserve">TCN Risk Details: </w:t>
       </w:r>
@@ -1395,8 +1513,8 @@
         <w:rPr>
           <w:rFonts w:ascii="Teshrin AR+LT ExtraLight" w:hAnsi="Teshrin AR+LT ExtraLight" w:cs="Teshrin AR+LT ExtraLight"/>
           <w:color w:val="FC4C02"/>
-          <w:sz w:val="28"/>
-          <w:szCs w:val="28"/>
+          <w:sz w:val="26"/>
+          <w:szCs w:val="26"/>
         </w:rPr>
       </w:pPr>
     </w:p>
@@ -1417,7 +1535,14 @@
           <w:rFonts w:ascii="Teshrin AR+LT" w:hAnsi="Teshrin AR+LT" w:cs="Teshrin AR+LT"/>
           <w:color w:val="253746"/>
         </w:rPr>
-        <w:t xml:space="preserve">CCTV Installation</w:t>
+        <w:t xml:space="preserve">CCTV </w:t>
+      </w:r>
+      <w:r>
+        <w:rPr>
+          <w:rFonts w:ascii="Teshrin AR+LT" w:hAnsi="Teshrin AR+LT" w:cs="Teshrin AR+LT"/>
+          <w:color w:val="253746"/>
+        </w:rPr>
+        <w:t>Installation</w:t>
       </w:r>
     </w:p>
     <w:p>
@@ -1435,8 +1560,8 @@
           <w:b/>
           <w:bCs/>
           <w:color w:val="FC4C02"/>
-          <w:sz w:val="28"/>
-          <w:szCs w:val="28"/>
+          <w:sz w:val="26"/>
+          <w:szCs w:val="26"/>
         </w:rPr>
       </w:pPr>
       <w:bookmarkStart w:id="0" w:name="_Hlk199256268"/>
@@ -1446,8 +1571,8 @@
           <w:b/>
           <w:bCs/>
           <w:color w:val="FC4C02"/>
-          <w:sz w:val="28"/>
-          <w:szCs w:val="28"/>
+          <w:sz w:val="26"/>
+          <w:szCs w:val="26"/>
         </w:rPr>
         <w:t xml:space="preserve">Step by step Procedure: </w:t>
       </w:r>
@@ -1457,8 +1582,8 @@
         <w:rPr>
           <w:rFonts w:ascii="Teshrin AR+LT ExtraLight" w:hAnsi="Teshrin AR+LT ExtraLight" w:cs="Teshrin AR+LT ExtraLight"/>
           <w:color w:val="FC4C02"/>
-          <w:sz w:val="28"/>
-          <w:szCs w:val="28"/>
+          <w:sz w:val="26"/>
+          <w:szCs w:val="26"/>
         </w:rPr>
       </w:pPr>
     </w:p>
@@ -1479,7 +1604,21 @@
           <w:rFonts w:ascii="Teshrin AR+LT" w:hAnsi="Teshrin AR+LT" w:cs="Teshrin AR+LT"/>
           <w:color w:val="253746"/>
         </w:rPr>
-        <w:t xml:space="preserve">Call TOC to open the TCN and confirm scope.</w:t>
+        <w:t>Call TOC to open the T</w:t>
+      </w:r>
+      <w:r>
+        <w:rPr>
+          <w:rFonts w:ascii="Teshrin AR+LT" w:hAnsi="Teshrin AR+LT" w:cs="Teshrin AR+LT"/>
+          <w:color w:val="253746"/>
+        </w:rPr>
+        <w:t>CN</w:t>
+      </w:r>
+      <w:r>
+        <w:rPr>
+          <w:rFonts w:ascii="Teshrin AR+LT" w:hAnsi="Teshrin AR+LT" w:cs="Teshrin AR+LT"/>
+          <w:color w:val="253746"/>
+        </w:rPr>
+        <w:t xml:space="preserve"> and confirm scope.</w:t>
       </w:r>
     </w:p>
     <w:p>
@@ -1583,7 +1722,28 @@
           <w:rFonts w:ascii="Teshrin AR+LT" w:hAnsi="Teshrin AR+LT" w:cs="Teshrin AR+LT"/>
           <w:color w:val="253746"/>
         </w:rPr>
-        <w:t xml:space="preserve">CCTV  Installation</w:t>
+        <w:t>CCTV</w:t>
+      </w:r>
+      <w:r>
+        <w:rPr>
+          <w:rFonts w:ascii="Teshrin AR+LT" w:hAnsi="Teshrin AR+LT" w:cs="Teshrin AR+LT"/>
+          <w:color w:val="253746"/>
+        </w:rPr>
+        <w:t xml:space="preserve"> </w:t>
+      </w:r>
+      <w:r>
+        <w:rPr>
+          <w:rFonts w:ascii="Teshrin AR+LT" w:hAnsi="Teshrin AR+LT" w:cs="Teshrin AR+LT"/>
+          <w:color w:val="253746"/>
+        </w:rPr>
+        <w:t xml:space="preserve"> </w:t>
+      </w:r>
+      <w:r>
+        <w:rPr>
+          <w:rFonts w:ascii="Teshrin AR+LT" w:hAnsi="Teshrin AR+LT" w:cs="Teshrin AR+LT"/>
+          <w:color w:val="253746"/>
+        </w:rPr>
+        <w:t>Installation</w:t>
       </w:r>
     </w:p>
     <w:p>
@@ -1620,8 +1780,8 @@
           <w:b/>
           <w:bCs/>
           <w:color w:val="FC4C02"/>
-          <w:sz w:val="28"/>
-          <w:szCs w:val="28"/>
+          <w:sz w:val="26"/>
+          <w:szCs w:val="26"/>
         </w:rPr>
         <w:t>NOT ALLOWED</w:t>
       </w:r>
@@ -1630,7 +1790,21 @@
           <w:rFonts w:ascii="Teshrin AR+LT" w:hAnsi="Teshrin AR+LT" w:cs="Teshrin AR+LT"/>
           <w:color w:val="253746"/>
         </w:rPr>
-        <w:t xml:space="preserve"> to check alarms at site during Installation ( Only Door Alarms to be report).</w:t>
+        <w:t xml:space="preserve"> to check alarms at site during </w:t>
+      </w:r>
+      <w:r>
+        <w:rPr>
+          <w:rFonts w:ascii="Teshrin AR+LT" w:hAnsi="Teshrin AR+LT" w:cs="Teshrin AR+LT"/>
+          <w:color w:val="253746"/>
+        </w:rPr>
+        <w:t>Installation (</w:t>
+      </w:r>
+      <w:r>
+        <w:rPr>
+          <w:rFonts w:ascii="Teshrin AR+LT" w:hAnsi="Teshrin AR+LT" w:cs="Teshrin AR+LT"/>
+          <w:color w:val="253746"/>
+        </w:rPr>
+        <w:t xml:space="preserve"> Only Door Alarms to be report).</w:t>
       </w:r>
     </w:p>
     <w:p>
@@ -1670,7 +1844,21 @@
           <w:rFonts w:ascii="Teshrin AR+LT" w:hAnsi="Teshrin AR+LT" w:cs="Teshrin AR+LT"/>
           <w:color w:val="253746"/>
         </w:rPr>
-        <w:t xml:space="preserve">Close TCN with TOC sign-off.</w:t>
+        <w:t xml:space="preserve">Close </w:t>
+      </w:r>
+      <w:r>
+        <w:rPr>
+          <w:rFonts w:ascii="Teshrin AR+LT" w:hAnsi="Teshrin AR+LT" w:cs="Teshrin AR+LT"/>
+          <w:color w:val="253746"/>
+        </w:rPr>
+        <w:t>TCN</w:t>
+      </w:r>
+      <w:r>
+        <w:rPr>
+          <w:rFonts w:ascii="Teshrin AR+LT" w:hAnsi="Teshrin AR+LT" w:cs="Teshrin AR+LT"/>
+          <w:color w:val="253746"/>
+        </w:rPr>
+        <w:t xml:space="preserve"> with TOC sign-off.</w:t>
       </w:r>
     </w:p>
     <w:p>
@@ -1708,8 +1896,8 @@
           <w:b/>
           <w:bCs/>
           <w:color w:val="FC4C02"/>
-          <w:sz w:val="28"/>
-          <w:szCs w:val="28"/>
+          <w:sz w:val="26"/>
+          <w:szCs w:val="26"/>
         </w:rPr>
       </w:pPr>
       <w:r>
@@ -1718,8 +1906,8 @@
           <w:b/>
           <w:bCs/>
           <w:color w:val="FC4C02"/>
-          <w:sz w:val="28"/>
-          <w:szCs w:val="28"/>
+          <w:sz w:val="26"/>
+          <w:szCs w:val="26"/>
         </w:rPr>
         <w:t>Rollback Procedure</w:t>
       </w:r>
@@ -1815,24 +2003,22 @@
           <w:rFonts w:ascii="Teshrin AR+LT" w:hAnsi="Teshrin AR+LT" w:cs="Teshrin AR+LT"/>
           <w:color w:val="253746"/>
         </w:rPr>
-        <w:t xml:space="preserve">Do not touch any equipment not covered by this TCN.</w:t>
+        <w:t xml:space="preserve">Do not touch any equipment not covered by this </w:t>
       </w:r>
-    </w:p>
-    <w:p>
-      <w:pPr>
-        <w:rPr>
-          <w:rFonts w:ascii="Teshrin AR+LT" w:hAnsi="Teshrin AR+LT" w:cs="Teshrin AR+LT"/>
-          <w:color w:val="253746"/>
-        </w:rPr>
-      </w:pPr>
-    </w:p>
-    <w:p>
-      <w:pPr>
-        <w:rPr>
-          <w:rFonts w:ascii="Teshrin AR+LT" w:hAnsi="Teshrin AR+LT" w:cs="Teshrin AR+LT"/>
-          <w:color w:val="273744"/>
-        </w:rPr>
-      </w:pPr>
+      <w:r>
+        <w:rPr>
+          <w:rFonts w:ascii="Teshrin AR+LT" w:hAnsi="Teshrin AR+LT" w:cs="Teshrin AR+LT"/>
+          <w:color w:val="253746"/>
+        </w:rPr>
+        <w:t>TCN</w:t>
+      </w:r>
+      <w:r>
+        <w:rPr>
+          <w:rFonts w:ascii="Teshrin AR+LT" w:hAnsi="Teshrin AR+LT" w:cs="Teshrin AR+LT"/>
+          <w:color w:val="253746"/>
+        </w:rPr>
+        <w:t>.</w:t>
+      </w:r>
     </w:p>
     <w:sectPr>
       <w:headerReference w:type="even" r:id="rId15"/>
@@ -6448,8 +6634,8 @@
     <w:rPrDefault>
       <w:rPr>
         <w:rFonts w:asciiTheme="minorHAnsi" w:eastAsiaTheme="minorHAnsi" w:hAnsiTheme="minorHAnsi" w:cstheme="minorBidi"/>
-        <w:sz w:val="24"/>
-        <w:szCs w:val="24"/>
+        <w:sz w:val="22"/>
+        <w:szCs w:val="22"/>
         <w:lang w:val="en-US" w:eastAsia="en-US" w:bidi="ar-SA"/>
       </w:rPr>
     </w:rPrDefault>

</xml_diff>